<commit_message>
Update bottle size from 30 mL to 60 mL (keep 30 servings)
Serving size changes from ~1 mL to ~2 mL per squeeze, giving more
room for ingredient solubility. Updated across all documents:
formulation, product brief, manufacturing guide, and brand guidelines.

Co-Authored-By: Claude Opus 4.6 <noreply@anthropic.com>
</commit_message>
<xml_diff>
--- a/SOMA_Brand_Guidelines_Final.docx
+++ b/SOMA_Brand_Guidelines_Final.docx
@@ -196,7 +196,7 @@
           <w:sz w:val="22"/>
           <w:szCs w:val="22"/>
         </w:rPr>
-        <w:t xml:space="preserve">The product comes in a pocket-sized 30–50 mL squish/squirt bottle (like Buoy) that makes upgrading your water effortless: one squeeze and you’re done. No droppers, no measuring, no fuss.</w:t>
+        <w:t xml:space="preserve">The product comes in a pocket-sized 60 mL squish/squirt bottle (like Buoy) that makes upgrading your water effortless: one squeeze and you’re done. No droppers, no measuring, no fuss.</w:t>
       </w:r>
     </w:p>
     <w:p>
@@ -2917,7 +2917,7 @@
                 <w:sz w:val="22"/>
                 <w:szCs w:val="22"/>
               </w:rPr>
-              <w:t xml:space="preserve">30–50 mL soft-touch matte squeezable plastic</w:t>
+              <w:t xml:space="preserve">60 mL soft-touch matte squeezable plastic</w:t>
             </w:r>
           </w:p>
         </w:tc>
@@ -6488,7 +6488,7 @@
                 <w:sz w:val="22"/>
                 <w:szCs w:val="22"/>
               </w:rPr>
-              <w:t xml:space="preserve">30 mL squish/squirt bottle, 30 servings</w:t>
+              <w:t xml:space="preserve">60 mL squish/squirt bottle, 30 servings</w:t>
             </w:r>
           </w:p>
         </w:tc>

</xml_diff>